<commit_message>
Regenerate June 8 paper push
</commit_message>
<xml_diff>
--- a/files/paper-push/daily_paper_push_2026-06-08.docx
+++ b/files/paper-push/daily_paper_push_2026-06-08.docx
@@ -42,7 +42,7 @@
         <w:rPr>
           <w:rFonts w:ascii="Microsoft YaHei" w:hAnsi="Microsoft YaHei" w:eastAsia="Microsoft YaHei"/>
         </w:rPr>
-        <w:t>历史去重后今日新增 8 篇。排序规则：Nature 系列、Science 系列、其余重点期刊、重点关注团队、其他相关补充论文。</w:t>
+        <w:t>历史去重后今日新增 6 篇。排序规则：Nature 系列、Science 系列、其余重点期刊、重点关注团队、其他相关补充论文。</w:t>
       </w:r>
     </w:p>
     <w:p>
@@ -128,7 +128,7 @@
         <w:rPr>
           <w:rFonts w:ascii="Microsoft YaHei" w:hAnsi="Microsoft YaHei" w:eastAsia="Microsoft YaHei"/>
         </w:rPr>
-        <w:t>这项研究关注有机碳输出和生物碳泵过程。 研究结合观测、模型或实验结果来刻画海洋生态和生物地球化学过程。 研究主要分析变化趋势、事件响应、驱动机制或方法表现，并把观测结果与生态和生物地球化学过程联系起来。 核心结果或实现为该主题提供了新的观测约束、方法基准或过程解释。 它有助于解释观测现象、比较方法差异，并为后续海洋生物地球化学分析提供线索。</w:t>
+        <w:t>摘要核心信息：This study examined the thermal resilience/susceptibility of Anomastraea irregularis (massive morphology) and Pocillopora verrucosa (branching morphology) collected from environmentally variable intertidal and more stable subtidal habitats from the east coast of South Africa. 摘要还提到：The intertidal corals decreased their respiration rates to control levels by the end of thermal stress and, both initially and throughout the study, maintained higher Symbiodiniaceae densities, chlorophyll-a, and lipid concentrations than their subtidal... 因此这条推荐归入 carbon pump; phytoplankton，不是只按标题做泛泛分类。 卡片会尽量保留论文摘要中的数据、方法或结果线索。 完整方法、采样背景和不确定性仍以论文链接和原文为准。</w:t>
       </w:r>
     </w:p>
     <w:p>
@@ -139,166 +139,6 @@
           <w:sz w:val="18"/>
         </w:rPr>
         <w:t>链接：https://doi.org/10.3389/fmars.2026.1828013</w:t>
-      </w:r>
-    </w:p>
-    <w:p>
-      <w:pPr>
-        <w:pStyle w:val="Heading3"/>
-      </w:pPr>
-      <w:r>
-        <w:rPr>
-          <w:rFonts w:ascii="Microsoft YaHei" w:hAnsi="Microsoft YaHei" w:eastAsia="Microsoft YaHei"/>
-          <w:b/>
-        </w:rPr>
-        <w:t>2. Phytoplankton community composition in the oligotrophic Argo Basin of the eastern Indian Ocean</w:t>
-      </w:r>
-    </w:p>
-    <w:p>
-      <w:r>
-        <w:rPr>
-          <w:rFonts w:ascii="Microsoft YaHei" w:hAnsi="Microsoft YaHei" w:eastAsia="Microsoft YaHei"/>
-          <w:color w:val="55697D"/>
-          <w:sz w:val="18"/>
-        </w:rPr>
-        <w:t>作者：Karen E. Selph; Robert H. Lampe; Natalia Yingling; Ria Bhabu; Sven A. Kranz; Andrew E. Allen; Michael R. Landry</w:t>
-      </w:r>
-    </w:p>
-    <w:p>
-      <w:r>
-        <w:rPr>
-          <w:rFonts w:ascii="Microsoft YaHei" w:hAnsi="Microsoft YaHei" w:eastAsia="Microsoft YaHei"/>
-          <w:color w:val="55697D"/>
-          <w:sz w:val="18"/>
-        </w:rPr>
-        <w:t>期刊：Deep Sea Research Part II: Topical Studies in Oceanography</w:t>
-      </w:r>
-    </w:p>
-    <w:p>
-      <w:r>
-        <w:rPr>
-          <w:rFonts w:ascii="Microsoft YaHei" w:hAnsi="Microsoft YaHei" w:eastAsia="Microsoft YaHei"/>
-          <w:color w:val="55697D"/>
-          <w:sz w:val="18"/>
-        </w:rPr>
-        <w:t>发表月份：2026-04</w:t>
-      </w:r>
-    </w:p>
-    <w:p>
-      <w:r>
-        <w:rPr>
-          <w:rFonts w:ascii="Microsoft YaHei" w:hAnsi="Microsoft YaHei" w:eastAsia="Microsoft YaHei"/>
-          <w:color w:val="55697D"/>
-          <w:sz w:val="18"/>
-        </w:rPr>
-        <w:t>DOI：10.1016/j.dsr2.2026.105602</w:t>
-      </w:r>
-    </w:p>
-    <w:p>
-      <w:r>
-        <w:rPr>
-          <w:rFonts w:ascii="Microsoft YaHei" w:hAnsi="Microsoft YaHei" w:eastAsia="Microsoft YaHei"/>
-          <w:b/>
-          <w:sz w:val="19"/>
-        </w:rPr>
-        <w:t>关键词：phytoplankton</w:t>
-      </w:r>
-    </w:p>
-    <w:p>
-      <w:r>
-        <w:rPr>
-          <w:rFonts w:ascii="Microsoft YaHei" w:hAnsi="Microsoft YaHei" w:eastAsia="Microsoft YaHei"/>
-        </w:rPr>
-        <w:t>这项研究关注浮游植物群落、生理状态和生产力变化。 数据基础是 BGC-Argo 浮标剖面及相关生物地球化学观测，可用于连接垂向结构和过程变化。 研究主要分析变化趋势、事件响应、驱动机制或方法表现，并把观测结果与生态和生物地球化学过程联系起来。 核心结果或实现为该主题提供了新的观测约束、方法基准或过程解释。 它有助于解释观测现象、比较方法差异，并为后续海洋生物地球化学分析提供线索。</w:t>
-      </w:r>
-    </w:p>
-    <w:p>
-      <w:r>
-        <w:rPr>
-          <w:rFonts w:ascii="Microsoft YaHei" w:hAnsi="Microsoft YaHei" w:eastAsia="Microsoft YaHei"/>
-          <w:color w:val="0563C1"/>
-          <w:sz w:val="18"/>
-        </w:rPr>
-        <w:t>链接：https://doi.org/10.1016/j.dsr2.2026.105602</w:t>
-      </w:r>
-    </w:p>
-    <w:p>
-      <w:pPr>
-        <w:pStyle w:val="Heading3"/>
-      </w:pPr>
-      <w:r>
-        <w:rPr>
-          <w:rFonts w:ascii="Microsoft YaHei" w:hAnsi="Microsoft YaHei" w:eastAsia="Microsoft YaHei"/>
-          <w:b/>
-        </w:rPr>
-        <w:t>3. Coupling ecological concepts with an ocean-colour model: inversion modelling</w:t>
-      </w:r>
-    </w:p>
-    <w:p>
-      <w:r>
-        <w:rPr>
-          <w:rFonts w:ascii="Microsoft YaHei" w:hAnsi="Microsoft YaHei" w:eastAsia="Microsoft YaHei"/>
-          <w:color w:val="55697D"/>
-          <w:sz w:val="18"/>
-        </w:rPr>
-        <w:t>作者：Xuerong Sun; Robert J. W. Brewin; Shubha Sathyendranath; Giorgio Dall’Olmo; David Antoine; Ray Barlow; Astrid Bracher; Malika Kheireddine; et al.</w:t>
-      </w:r>
-    </w:p>
-    <w:p>
-      <w:r>
-        <w:rPr>
-          <w:rFonts w:ascii="Microsoft YaHei" w:hAnsi="Microsoft YaHei" w:eastAsia="Microsoft YaHei"/>
-          <w:color w:val="55697D"/>
-          <w:sz w:val="18"/>
-        </w:rPr>
-        <w:t>期刊：Remote Sensing</w:t>
-      </w:r>
-    </w:p>
-    <w:p>
-      <w:r>
-        <w:rPr>
-          <w:rFonts w:ascii="Microsoft YaHei" w:hAnsi="Microsoft YaHei" w:eastAsia="Microsoft YaHei"/>
-          <w:color w:val="55697D"/>
-          <w:sz w:val="18"/>
-        </w:rPr>
-        <w:t>发表月份：2026-01</w:t>
-      </w:r>
-    </w:p>
-    <w:p>
-      <w:r>
-        <w:rPr>
-          <w:rFonts w:ascii="Microsoft YaHei" w:hAnsi="Microsoft YaHei" w:eastAsia="Microsoft YaHei"/>
-          <w:color w:val="55697D"/>
-          <w:sz w:val="18"/>
-        </w:rPr>
-        <w:t>DOI：10.3389/frsen.2025.1692306</w:t>
-      </w:r>
-    </w:p>
-    <w:p>
-      <w:r>
-        <w:rPr>
-          <w:rFonts w:ascii="Microsoft YaHei" w:hAnsi="Microsoft YaHei" w:eastAsia="Microsoft YaHei"/>
-          <w:b/>
-          <w:sz w:val="19"/>
-        </w:rPr>
-        <w:t>关键词：phytoplankton; ocean colour; ocean optics; absorption; bio-optics</w:t>
-      </w:r>
-    </w:p>
-    <w:p>
-      <w:r>
-        <w:rPr>
-          <w:rFonts w:ascii="Microsoft YaHei" w:hAnsi="Microsoft YaHei" w:eastAsia="Microsoft YaHei"/>
-        </w:rPr>
-        <w:t>这项研究关注海洋生物光学和海洋光学参数、方法与应用。 数据上主要面向卫星海色、叶绿素或遥感反射率记录，并在需要时结合原位或剖面观测进行约束。 研究主要分析变化趋势、事件响应、驱动机制或方法表现，并把观测结果与生态和生物地球化学过程联系起来。 核心结果或实现为该主题提供了新的观测约束、方法基准或过程解释。 它有助于解释观测现象、比较方法差异，并为后续海洋生物地球化学分析提供线索。</w:t>
-      </w:r>
-    </w:p>
-    <w:p>
-      <w:r>
-        <w:rPr>
-          <w:rFonts w:ascii="Microsoft YaHei" w:hAnsi="Microsoft YaHei" w:eastAsia="Microsoft YaHei"/>
-          <w:color w:val="0563C1"/>
-          <w:sz w:val="18"/>
-        </w:rPr>
-        <w:t>链接：https://doi.org/10.3389/frsen.2025.1692306</w:t>
       </w:r>
     </w:p>
     <w:p>
@@ -318,7 +158,87 @@
           <w:rFonts w:ascii="Microsoft YaHei" w:hAnsi="Microsoft YaHei" w:eastAsia="Microsoft YaHei"/>
           <w:b/>
         </w:rPr>
-        <w:t>4. Research on the Effect of Polar Marine Microbial Carbon Pump and Its Response Mechanisms to Climate Change</w:t>
+        <w:t>2. Warm-core eddy intensifies surface mixotrophic bacterivory and fuels mesopelagic heterotrophic grazing</w:t>
+      </w:r>
+    </w:p>
+    <w:p>
+      <w:r>
+        <w:rPr>
+          <w:rFonts w:ascii="Microsoft YaHei" w:hAnsi="Microsoft YaHei" w:eastAsia="Microsoft YaHei"/>
+          <w:color w:val="55697D"/>
+          <w:sz w:val="18"/>
+        </w:rPr>
+        <w:t>作者：Ying Wang; Xin Liu; Zhonghua Zhao; Dapeng Xu; Bangqin Huang; Ping Sun</w:t>
+      </w:r>
+    </w:p>
+    <w:p>
+      <w:r>
+        <w:rPr>
+          <w:rFonts w:ascii="Microsoft YaHei" w:hAnsi="Microsoft YaHei" w:eastAsia="Microsoft YaHei"/>
+          <w:color w:val="55697D"/>
+          <w:sz w:val="18"/>
+        </w:rPr>
+        <w:t>期刊：Communications Biology</w:t>
+      </w:r>
+    </w:p>
+    <w:p>
+      <w:r>
+        <w:rPr>
+          <w:rFonts w:ascii="Microsoft YaHei" w:hAnsi="Microsoft YaHei" w:eastAsia="Microsoft YaHei"/>
+          <w:color w:val="55697D"/>
+          <w:sz w:val="18"/>
+        </w:rPr>
+        <w:t>发表月份：2026-06</w:t>
+      </w:r>
+    </w:p>
+    <w:p>
+      <w:r>
+        <w:rPr>
+          <w:rFonts w:ascii="Microsoft YaHei" w:hAnsi="Microsoft YaHei" w:eastAsia="Microsoft YaHei"/>
+          <w:color w:val="55697D"/>
+          <w:sz w:val="18"/>
+        </w:rPr>
+        <w:t>DOI：10.1038/s42003-026-10438-y</w:t>
+      </w:r>
+    </w:p>
+    <w:p>
+      <w:r>
+        <w:rPr>
+          <w:rFonts w:ascii="Microsoft YaHei" w:hAnsi="Microsoft YaHei" w:eastAsia="Microsoft YaHei"/>
+          <w:b/>
+          <w:sz w:val="19"/>
+        </w:rPr>
+        <w:t>关键词：phytoplankton; microbial carbon; vertical structure</w:t>
+      </w:r>
+    </w:p>
+    <w:p>
+      <w:r>
+        <w:rPr>
+          <w:rFonts w:ascii="Microsoft YaHei" w:hAnsi="Microsoft YaHei" w:eastAsia="Microsoft YaHei"/>
+        </w:rPr>
+        <w:t>摘要核心信息：We quantify bacterivory by phago-mixotrophic nanophytoplankton (PMNP) and heterotrophic nanoflagellate (HNF) using fluorescent-bead incubations in a warm-core ACE in the South China Sea. 摘要还提到：4× deep chlorophyll maximum (DCM), shifts toward larger cells, and elevates bacterial turnover and phago-mixotrophic production. 因此这条推荐归入 phytoplankton; microbial carbon; vertical structure，不是只按标题做泛泛分类。 卡片会尽量保留论文摘要中的数据、方法或结果线索。 完整方法、采样背景和不确定性仍以论文链接和原文为准。</w:t>
+      </w:r>
+    </w:p>
+    <w:p>
+      <w:r>
+        <w:rPr>
+          <w:rFonts w:ascii="Microsoft YaHei" w:hAnsi="Microsoft YaHei" w:eastAsia="Microsoft YaHei"/>
+          <w:color w:val="0563C1"/>
+          <w:sz w:val="18"/>
+        </w:rPr>
+        <w:t>链接：https://doi.org/10.1038/s42003-026-10438-y</w:t>
+      </w:r>
+    </w:p>
+    <w:p>
+      <w:pPr>
+        <w:pStyle w:val="Heading3"/>
+      </w:pPr>
+      <w:r>
+        <w:rPr>
+          <w:rFonts w:ascii="Microsoft YaHei" w:hAnsi="Microsoft YaHei" w:eastAsia="Microsoft YaHei"/>
+          <w:b/>
+        </w:rPr>
+        <w:t>3. Research on the Effect of Polar Marine Microbial Carbon Pump and Its Response Mechanisms to Climate Change</w:t>
       </w:r>
     </w:p>
     <w:p>
@@ -376,7 +296,7 @@
         <w:rPr>
           <w:rFonts w:ascii="Microsoft YaHei" w:hAnsi="Microsoft YaHei" w:eastAsia="Microsoft YaHei"/>
         </w:rPr>
-        <w:t>这项研究关注有机碳输出和生物碳泵过程。 研究结合观测、模型或实验结果来刻画海洋生态和生物地球化学过程。 研究主要分析变化趋势、事件响应、驱动机制或方法表现，并把观测结果与生态和生物地球化学过程联系起来。 核心结果或实现为该主题提供了新的观测约束、方法基准或过程解释。 它有助于解释观测现象、比较方法差异，并为后续海洋生物地球化学分析提供线索。</w:t>
+        <w:t>摘要核心信息：The polar marine microbial carbon pump (MCP) is a key component in global carbon sequestration and climate regulation systems. 摘要还提到：We are focusing on the microbial communities in arctic and antarctic waters, their physiologic/evolutionary adaptation strategies and carbon transformation abilities under environmental change forcing. 因此这条推荐归入 carbon pump; microbial carbon，不是只按标题做泛泛分类。 卡片会尽量保留论文摘要中的数据、方法或结果线索。 完整方法、采样背景和不确定性仍以论文链接和原文为准。</w:t>
       </w:r>
     </w:p>
     <w:p>
@@ -398,87 +318,7 @@
           <w:rFonts w:ascii="Microsoft YaHei" w:hAnsi="Microsoft YaHei" w:eastAsia="Microsoft YaHei"/>
           <w:b/>
         </w:rPr>
-        <w:t>5. Evaluation of Different Approaches for Assessing Water Quality Using Sentinel-2/MSI: A Case Study in Coastal Ningde</w:t>
-      </w:r>
-    </w:p>
-    <w:p>
-      <w:r>
-        <w:rPr>
-          <w:rFonts w:ascii="Microsoft YaHei" w:hAnsi="Microsoft YaHei" w:eastAsia="Microsoft YaHei"/>
-          <w:color w:val="55697D"/>
-          <w:sz w:val="18"/>
-        </w:rPr>
-        <w:t>作者：Binbin Jiang; Daidu Fan; Qinghui Huang; Xueding Li; Nguyen Dac Ve; Fahui Ren; Junyu Yu; Emmanuel Boss</w:t>
-      </w:r>
-    </w:p>
-    <w:p>
-      <w:r>
-        <w:rPr>
-          <w:rFonts w:ascii="Microsoft YaHei" w:hAnsi="Microsoft YaHei" w:eastAsia="Microsoft YaHei"/>
-          <w:color w:val="55697D"/>
-          <w:sz w:val="18"/>
-        </w:rPr>
-        <w:t>期刊：Journal of Marine Science and Engineering</w:t>
-      </w:r>
-    </w:p>
-    <w:p>
-      <w:r>
-        <w:rPr>
-          <w:rFonts w:ascii="Microsoft YaHei" w:hAnsi="Microsoft YaHei" w:eastAsia="Microsoft YaHei"/>
-          <w:color w:val="55697D"/>
-          <w:sz w:val="18"/>
-        </w:rPr>
-        <w:t>发表月份：2026-01</w:t>
-      </w:r>
-    </w:p>
-    <w:p>
-      <w:r>
-        <w:rPr>
-          <w:rFonts w:ascii="Microsoft YaHei" w:hAnsi="Microsoft YaHei" w:eastAsia="Microsoft YaHei"/>
-          <w:color w:val="55697D"/>
-          <w:sz w:val="18"/>
-        </w:rPr>
-        <w:t>DOI：10.3390/jmse14030267</w:t>
-      </w:r>
-    </w:p>
-    <w:p>
-      <w:r>
-        <w:rPr>
-          <w:rFonts w:ascii="Microsoft YaHei" w:hAnsi="Microsoft YaHei" w:eastAsia="Microsoft YaHei"/>
-          <w:b/>
-          <w:sz w:val="19"/>
-        </w:rPr>
-        <w:t>关键词：phytoplankton; ocean colour</w:t>
-      </w:r>
-    </w:p>
-    <w:p>
-      <w:r>
-        <w:rPr>
-          <w:rFonts w:ascii="Microsoft YaHei" w:hAnsi="Microsoft YaHei" w:eastAsia="Microsoft YaHei"/>
-        </w:rPr>
-        <w:t>这项研究关注海色遥感中的浮游植物和光学信号变化。 数据上主要面向卫星海色、叶绿素或遥感反射率记录，并在需要时结合原位或剖面观测进行约束。 研究主要分析变化趋势、事件响应、驱动机制或方法表现，并把观测结果与生态和生物地球化学过程联系起来。 核心实现是提出可复用的框架、流程或数据产品，使类似观测、反演、验证或趋势分析可以更系统地开展。 它有助于解释观测现象、比较方法差异，并为后续海洋生物地球化学分析提供线索。</w:t>
-      </w:r>
-    </w:p>
-    <w:p>
-      <w:r>
-        <w:rPr>
-          <w:rFonts w:ascii="Microsoft YaHei" w:hAnsi="Microsoft YaHei" w:eastAsia="Microsoft YaHei"/>
-          <w:color w:val="0563C1"/>
-          <w:sz w:val="18"/>
-        </w:rPr>
-        <w:t>链接：https://doi.org/10.3390/jmse14030267</w:t>
-      </w:r>
-    </w:p>
-    <w:p>
-      <w:pPr>
-        <w:pStyle w:val="Heading3"/>
-      </w:pPr>
-      <w:r>
-        <w:rPr>
-          <w:rFonts w:ascii="Microsoft YaHei" w:hAnsi="Microsoft YaHei" w:eastAsia="Microsoft YaHei"/>
-          <w:b/>
-        </w:rPr>
-        <w:t>6. Impacts of phytoplankton blooms on the benthic phosphorus cycle in a macro-tidal coastal ecosystem (Bay of Vilaine, France)</w:t>
+        <w:t>4. Impacts of phytoplankton blooms on the benthic phosphorus cycle in a macro-tidal coastal ecosystem (Bay of Vilaine, France)</w:t>
       </w:r>
     </w:p>
     <w:p>
@@ -536,7 +376,7 @@
         <w:rPr>
           <w:rFonts w:ascii="Microsoft YaHei" w:hAnsi="Microsoft YaHei" w:eastAsia="Microsoft YaHei"/>
         </w:rPr>
-        <w:t>这项研究关注浮游植物群落、生理状态和生产力变化。 研究结合观测、模型或实验结果来刻画海洋生态和生物地球化学过程。 研究主要分析变化趋势、事件响应、驱动机制或方法表现，并把观测结果与生态和生物地球化学过程联系起来。 核心结果或实现为该主题提供了新的观测约束、方法基准或过程解释。 它有助于解释观测现象、比较方法差异，并为后续海洋生物地球化学分析提供线索。</w:t>
+        <w:t>Crossref 当前没有提供可用摘要。 这张卡片只能作为 浮游植物群落、生理状态和生产力变化 的发现线索，不冒充论文内容总结。 研究结合观测、模型或实验结果来刻画海洋生态和生物地球化学过程。 研究主要分析变化趋势、事件响应、驱动机制或方法表现，并把观测结果与生态和生物地球化学过程联系起来。 在确认方法、采样背景或结果细节前，应打开论文链接查看原文。</w:t>
       </w:r>
     </w:p>
     <w:p>
@@ -558,7 +398,7 @@
           <w:rFonts w:ascii="Microsoft YaHei" w:hAnsi="Microsoft YaHei" w:eastAsia="Microsoft YaHei"/>
           <w:b/>
         </w:rPr>
-        <w:t>7. Comprehensive Ecological Health Assessment of Estuarine and Coastal Ecosystems Based on Remote Sensing and Multi-Source Data: A Case Study of Qinzhou Bay</w:t>
+        <w:t>5. Comprehensive Ecological Health Assessment of Estuarine and Coastal Ecosystems Based on Remote Sensing and Multi-Source Data: A Case Study of Qinzhou Bay</w:t>
       </w:r>
     </w:p>
     <w:p>
@@ -616,7 +456,7 @@
         <w:rPr>
           <w:rFonts w:ascii="Microsoft YaHei" w:hAnsi="Microsoft YaHei" w:eastAsia="Microsoft YaHei"/>
         </w:rPr>
-        <w:t>这项研究关注海色遥感中的浮游植物和光学信号变化。 数据上主要面向卫星海色、叶绿素或遥感反射率记录，并在需要时结合原位或剖面观测进行约束。 研究主要分析变化趋势、事件响应、驱动机制或方法表现，并把观测结果与生态和生物地球化学过程联系起来。 核心结果或实现为该主题提供了新的观测约束、方法基准或过程解释。 它有助于解释观测现象、比较方法差异，并为后续海洋生物地球化学分析提供线索。</w:t>
+        <w:t>摘要核心信息：Taking Qinzhou Bay as a case study, this research incorporated multi-source data (including water quality indicators retrieved from remote sensing imagery, mariculture distribution, and land use information) into an integrated ecological health assessment system... 摘要还提到：This study incorporated multi-source data, including remote sensing, into the PSR model framework, thereby advancing ecological health assessment from conventional discrete station-based evaluation to spatially continuous assessment. 因此这条推荐归入 ocean colour，不是只按标题做泛泛分类。 卡片会尽量保留论文摘要中的数据、方法或结果线索。 完整方法、采样背景和不确定性仍以论文链接和原文为准。</w:t>
       </w:r>
     </w:p>
     <w:p>
@@ -646,7 +486,7 @@
           <w:rFonts w:ascii="Microsoft YaHei" w:hAnsi="Microsoft YaHei" w:eastAsia="Microsoft YaHei"/>
           <w:b/>
         </w:rPr>
-        <w:t>8. Mapping Potential Fishing Zones as Indicators of Pelagic Ecosystem Service Hotspots in the Makassar Strait using Satellite-Derived SST and Chlorophyll-a Anomalies</w:t>
+        <w:t>6. Mapping Potential Fishing Zones as Indicators of Pelagic Ecosystem Service Hotspots in the Makassar Strait using Satellite-Derived SST and Chlorophyll-a Anomalies</w:t>
       </w:r>
     </w:p>
     <w:p>
@@ -704,7 +544,7 @@
         <w:rPr>
           <w:rFonts w:ascii="Microsoft YaHei" w:hAnsi="Microsoft YaHei" w:eastAsia="Microsoft YaHei"/>
         </w:rPr>
-        <w:t>这项研究关注浮游植物群落、生理状态和生产力变化。 数据上主要面向卫星海色、叶绿素或遥感反射率记录，并在需要时结合原位或剖面观测进行约束。 研究主要分析变化趋势、事件响应、驱动机制或方法表现，并把观测结果与生态和生物地球化学过程联系起来。 核心结果或实现为该主题提供了新的观测约束、方法基准或过程解释。 它有助于解释观测现象、比较方法差异，并为后续海洋生物地球化学分析提供线索。</w:t>
+        <w:t>摘要核心信息：This study developed an anomaly-based framework to map potential fishing zones (PFZs) in the Makassar Strait from satellite-derived sea surface temperature (SST) and chlorophyll-a (Chl-a) during 2022–2024. 摘要还提到：These findings indicate that recurrent PFZs can be interpreted as pelagic ecosystem service hotspots that support ecosystem-based fisheries management, biodiversity conservation, and the sustainable use of marine resources, while aligning with SDG 14 (Life... 因此这条推荐归入 phytoplankton，不是只按标题做泛泛分类。 卡片会尽量保留论文摘要中的数据、方法或结果线索。 完整方法、采样背景和不确定性仍以论文链接和原文为准。</w:t>
       </w:r>
     </w:p>
     <w:p>

</xml_diff>

<commit_message>
Use abstracts for paper summaries
</commit_message>
<xml_diff>
--- a/files/paper-push/daily_paper_push_2026-06-08.docx
+++ b/files/paper-push/daily_paper_push_2026-06-08.docx
@@ -127,8 +127,9 @@
       <w:r>
         <w:rPr>
           <w:rFonts w:ascii="Microsoft YaHei" w:hAnsi="Microsoft YaHei" w:eastAsia="Microsoft YaHei"/>
+          <w:sz w:val="17"/>
         </w:rPr>
-        <w:t>摘要核心信息：This study examined the thermal resilience/susceptibility of Anomastraea irregularis (massive morphology) and Pocillopora verrucosa (branching morphology) collected from environmentally variable intertidal and more stable subtidal habitats from the east coast of South Africa. 摘要还提到：The intertidal corals decreased their respiration rates to control levels by the end of thermal stress and, both initially and throughout the study, maintained higher Symbiodiniaceae densities, chlorophyll-a, and lipid concentrations than their subtidal... 因此这条推荐归入 carbon pump; phytoplankton，不是只按标题做泛泛分类。 卡片会尽量保留论文摘要中的数据、方法或结果线索。 完整方法、采样背景和不确定性仍以论文链接和原文为准。</w:t>
+        <w:t>摘要：Introduction Thermal stress experiments on corals from habitats with contrasting environmental regimes in understudied regions, such as South Africa, are essential to elucidate the mechanisms underlying coral resilience/susceptibility to thermal stress. This study examined the thermal resilience/susceptibility of Anomastraea irregularis (massive morphology) and Pocillopora verrucosa (branching morphology) collected from environmentally variable intertidal and more stable subtidal habitats from the east coast of South Africa. Methods Corals were maintained in closed recirculating aquaria and exposed to two thermal stress conditions (28°C and 30°C) for three months, followed by recovery at control conditions (26°C) for two months. Rates of respiration, photosynthesis, and growth were measured monthly. The Symbiodiniaceae density, chlorophyll-a concentration, and lipid concentration were analysed at the start and end of the thermal stress and at the end of the recovery period. Results The treatments induced bleaching in both species from both habitats with an associated decrease in photosynthetic and growth rates. Inherent differences across all measured physiological parameters, including variation in survival, were observed between the species and habitat throughout the experiment, highlighting that environmental origin and possibly morphology can influence thermal tolerance. The intertidal corals were more tolerant than their subtidal conspecifics, and A. irregularis appeared more tolerant than P. verrucosa in both treatments. The intertidal corals decreased their respiration rates to control levels by the end of thermal stress and, both initially and throughout the study, maintained higher Symbiodiniaceae densities, chlorophyll-a, and lipid concentrations than their subtidal conspecifics. Discussion The tolerance of A. irregularis may stem from thicker tissue which allowed higher Symbiodiniaceae density and lipid concentrations and lower P:R ratios consistent with a more heterotrophic nature. The photosynthetic and growth rates, Symbiodiniaceae density, chlorophyll-a concentration, and lipid concentration of both species from both habitats did not recover two months after thermal stress indicating that restoration of physiological homeostasis following prolonged thermal stress likely requires substantially longer periods. Therefore, the results in this study should be interpreted as evidence of differential tolerance and early recovery responses rather than complete resilience. These findings provide insight into the physiological mechanisms underpinning thermal tolerance in high-latitude corals, highlighting that corals persisting in environmentally variable environments can exhibit traits critical for understanding resilience to climate change. An important caveat to consider, despite regular water changes, the closed recirculating systems may accumulate metabolic waste products over time, which can independently affect coral physiology and confound thermal stress responses.</w:t>
       </w:r>
     </w:p>
     <w:p>
@@ -215,8 +216,9 @@
       <w:r>
         <w:rPr>
           <w:rFonts w:ascii="Microsoft YaHei" w:hAnsi="Microsoft YaHei" w:eastAsia="Microsoft YaHei"/>
+          <w:sz w:val="17"/>
         </w:rPr>
-        <w:t>摘要核心信息：We quantify bacterivory by phago-mixotrophic nanophytoplankton (PMNP) and heterotrophic nanoflagellate (HNF) using fluorescent-bead incubations in a warm-core ACE in the South China Sea. 摘要还提到：4× deep chlorophyll maximum (DCM), shifts toward larger cells, and elevates bacterial turnover and phago-mixotrophic production. 因此这条推荐归入 phytoplankton; microbial carbon; vertical structure，不是只按标题做泛泛分类。 卡片会尽量保留论文摘要中的数据、方法或结果线索。 完整方法、采样背景和不确定性仍以论文链接和原文为准。</w:t>
+        <w:t>摘要：Abstract Anticyclonic eddies (ACEs) restructure resources and drive trophic cascades, yet depth-resolved effects on nanoflagellate bacterivory remain unclear. We quantify bacterivory by phago-mixotrophic nanophytoplankton (PMNP) and heterotrophic nanoflagellate (HNF) using fluorescent-bead incubations in a warm-core ACE in the South China Sea. Despite a 16% decline in nanoeukaryotes, PMNP abundance increases significantly (2.8× surface, 1.4× deep chlorophyll maximum (DCM), shifts toward larger cells, and elevates bacterial turnover and phago-mixotrophic production. HNF community grazing also increases at both euphotic depths despite similar per-cell rates, yielding impacts comparable to PMNP. Structural equation models link PMNP grazing to surface water-mass properties and nutrients and DCM turbidity, whereas HNF grazing tracks water-mass and prey/virus dynamics. In the mesopelagic zone, HNFs dominate; grazing HNF abundance increases 2.7× at 500 m and is associated with particulate beam attenuation coefficient, an in situ particle proxy. These findings reveal a depth-partitioned response coupling mesoscale forcing to microbial carbon processing.</w:t>
       </w:r>
     </w:p>
     <w:p>
@@ -295,8 +297,9 @@
       <w:r>
         <w:rPr>
           <w:rFonts w:ascii="Microsoft YaHei" w:hAnsi="Microsoft YaHei" w:eastAsia="Microsoft YaHei"/>
+          <w:sz w:val="17"/>
         </w:rPr>
-        <w:t>摘要核心信息：The polar marine microbial carbon pump (MCP) is a key component in global carbon sequestration and climate regulation systems. 摘要还提到：We are focusing on the microbial communities in arctic and antarctic waters, their physiologic/evolutionary adaptation strategies and carbon transformation abilities under environmental change forcing. 因此这条推荐归入 carbon pump; microbial carbon，不是只按标题做泛泛分类。 卡片会尽量保留论文摘要中的数据、方法或结果线索。 完整方法、采样背景和不确定性仍以论文链接和原文为准。</w:t>
+        <w:t>摘要：The polar marine microbial carbon pump (MCP) is a key component in global carbon sequestration and climate regulation systems. The research addresses the regulatory and adaptive principles of the polar marine MCP systems in response to climate change by conducting an integrated research on the microbial ecological, biogeochemical and environmental adaptation processes. We are focusing on the microbial communities in arctic and antarctic waters, their physiologic/evolutionary adaptation strategies and carbon transformation abilities under environmental change forcing. Our research has demonstrated that marine polar microorganisms have developed sophisticated strategies to survive in such a cold environment with responses of high expression of cryoprotectants, changes of cell membrane and metabolic pathways. The research suggests that anthropogenic global warming has dramatic effects on the efficiency of MCP due to shifts of thermal conditions, cryospheric processes and carbonate chemistry. Notably, our comparative study revealed that the polar region responses are different between polar regions as the Arctic had high metabolic flexibility, while Antarctic had high cold-adapted Arctic. These findings help us get valuable information regarding the sensitivity of polar carbon storage systems and potential feedbacks to climate.</w:t>
       </w:r>
     </w:p>
     <w:p>
@@ -375,8 +378,9 @@
       <w:r>
         <w:rPr>
           <w:rFonts w:ascii="Microsoft YaHei" w:hAnsi="Microsoft YaHei" w:eastAsia="Microsoft YaHei"/>
+          <w:sz w:val="17"/>
         </w:rPr>
-        <w:t>Crossref 当前没有提供可用摘要。 这张卡片只能作为 浮游植物群落、生理状态和生产力变化 的发现线索，不冒充论文内容总结。 研究结合观测、模型或实验结果来刻画海洋生态和生物地球化学过程。 研究主要分析变化趋势、事件响应、驱动机制或方法表现，并把观测结果与生态和生物地球化学过程联系起来。 在确认方法、采样背景或结果细节前，应打开论文链接查看原文。</w:t>
+        <w:t>摘要：Crossref 未提供该 DOI 的摘要。</w:t>
       </w:r>
     </w:p>
     <w:p>
@@ -455,8 +459,9 @@
       <w:r>
         <w:rPr>
           <w:rFonts w:ascii="Microsoft YaHei" w:hAnsi="Microsoft YaHei" w:eastAsia="Microsoft YaHei"/>
+          <w:sz w:val="17"/>
         </w:rPr>
-        <w:t>摘要核心信息：Taking Qinzhou Bay as a case study, this research incorporated multi-source data (including water quality indicators retrieved from remote sensing imagery, mariculture distribution, and land use information) into an integrated ecological health assessment system... 摘要还提到：This study incorporated multi-source data, including remote sensing, into the PSR model framework, thereby advancing ecological health assessment from conventional discrete station-based evaluation to spatially continuous assessment. 因此这条推荐归入 ocean colour，不是只按标题做泛泛分类。 卡片会尽量保留论文摘要中的数据、方法或结果线索。 完整方法、采样背景和不确定性仍以论文链接和原文为准。</w:t>
+        <w:t>摘要：Estuarine and coastal ecosystems are facing significant threats from compounded pressures, such as land-based pollution and mariculture activities. These ecosystems confront severe challenges, including increasing environmental burdens and declining ecological health. Traditional evaluation methods that rely on statistical data struggle to meet the requirements for refined management of estuarine and coastal water environments. Taking Qinzhou Bay as a case study, this research incorporated multi-source data (including water quality indicators retrieved from remote sensing imagery, mariculture distribution, and land use information) into an integrated ecological health assessment system that combined remotely sensed data with the Pressure–State–Response (PSR) model. This approach enables a spatially continuous and quantitative evaluation of ecological health conditions for August 2015 (flood season), December 2015 (non-flood season), May 2022 (flood season), and December 2022 (non-flood season). The results indicated significant seasonal differences in the ecological health of Qinzhou Bay, with conditions generally better during the non-flood season than the flood season. Based on a comparison between the indicative estimation for 2015 and the inversion results for 2022, the overall ecological health index in 2022 showed an increasing trend, although some nearshore and estuarine areas experienced a declining trend. This study incorporated multi-source data, including remote sensing, into the PSR model framework, thereby advancing ecological health assessment from conventional discrete station-based evaluation to spatially continuous assessment. The effectiveness of this methodological approach in identifying spatiotemporal variations in the ecological health of estuarine and coastal zones was validated, providing scientific support for the refined management of estuarine and coastal water environments and ecological restoration.</w:t>
       </w:r>
     </w:p>
     <w:p>
@@ -543,8 +548,9 @@
       <w:r>
         <w:rPr>
           <w:rFonts w:ascii="Microsoft YaHei" w:hAnsi="Microsoft YaHei" w:eastAsia="Microsoft YaHei"/>
+          <w:sz w:val="17"/>
         </w:rPr>
-        <w:t>摘要核心信息：This study developed an anomaly-based framework to map potential fishing zones (PFZs) in the Makassar Strait from satellite-derived sea surface temperature (SST) and chlorophyll-a (Chl-a) during 2022–2024. 摘要还提到：These findings indicate that recurrent PFZs can be interpreted as pelagic ecosystem service hotspots that support ecosystem-based fisheries management, biodiversity conservation, and the sustainable use of marine resources, while aligning with SDG 14 (Life... 因此这条推荐归入 phytoplankton，不是只按标题做泛泛分类。 卡片会尽量保留论文摘要中的数据、方法或结果线索。 完整方法、采样背景和不确定性仍以论文链接和原文为准。</w:t>
+        <w:t>摘要：This study developed an anomaly-based framework to map potential fishing zones (PFZs) in the Makassar Strait from satellite-derived sea surface temperature (SST) and chlorophyll-a (Chl-a) during 2022–2024. Daily GCOM-C/SGLI Level-3 Version 3 products were quality-masked, converted to physical units, aggregated to a 0.1° × 0.1° grid, and summarized as monthly composites. Monthly anomalies were then calculated relative to a month-specific three-year climatology. PFZs were defined as pixels simultaneously showing high Chl-a anomalies, represented by the 80th percentile of the spatial distribution of the temporal mean anomaly field, and relative cooling (SST anomaly ≤ 0). Monthly PFZ area ranged from 4,658 to 144,923 km², with a mean of 52,606 ± 33,834 km², whereas PFZ area fraction ranged from 0.012 to 0.352, with a mean of 0.130 ± 0.084. Seasonally, PFZs were most extensive during JJA (mean 66,973 km²; fraction 0.161) and least extensive during DJF (43,046 km²; fraction 0.112). Recurrent PFZ hotspots were concentrated in the central-southern Makassar Strait and along the eastern sector near the Sulawesi coast, where occurrence frequency reached about 58%. Valid-pixel diagnostics showed relatively stable AOI-level coverage (SST mean 0.534; Chl-a mean 0.548), indicating that the observed PFZ variability could not be explained by data gaps alone. These findings indicate that recurrent PFZs can be interpreted as pelagic ecosystem service hotspots that support ecosystem-based fisheries management, biodiversity conservation, and the sustainable use of marine resources, while aligning with SDG 14 (Life Below Water) and the post-2020 global biodiversity framework of the Convention on Biological Diversity.</w:t>
       </w:r>
     </w:p>
     <w:p>

</xml_diff>

<commit_message>
Translate Chinese paper abstracts
</commit_message>
<xml_diff>
--- a/files/paper-push/daily_paper_push_2026-06-08.docx
+++ b/files/paper-push/daily_paper_push_2026-06-08.docx
@@ -129,7 +129,7 @@
           <w:rFonts w:ascii="Microsoft YaHei" w:hAnsi="Microsoft YaHei" w:eastAsia="Microsoft YaHei"/>
           <w:sz w:val="17"/>
         </w:rPr>
-        <w:t>摘要：Introduction Thermal stress experiments on corals from habitats with contrasting environmental regimes in understudied regions, such as South Africa, are essential to elucidate the mechanisms underlying coral resilience/susceptibility to thermal stress. This study examined the thermal resilience/susceptibility of Anomastraea irregularis (massive morphology) and Pocillopora verrucosa (branching morphology) collected from environmentally variable intertidal and more stable subtidal habitats from the east coast of South Africa. Methods Corals were maintained in closed recirculating aquaria and exposed to two thermal stress conditions (28°C and 30°C) for three months, followed by recovery at control conditions (26°C) for two months. Rates of respiration, photosynthesis, and growth were measured monthly. The Symbiodiniaceae density, chlorophyll-a concentration, and lipid concentration were analysed at the start and end of the thermal stress and at the end of the recovery period. Results The treatments induced bleaching in both species from both habitats with an associated decrease in photosynthetic and growth rates. Inherent differences across all measured physiological parameters, including variation in survival, were observed between the species and habitat throughout the experiment, highlighting that environmental origin and possibly morphology can influence thermal tolerance. The intertidal corals were more tolerant than their subtidal conspecifics, and A. irregularis appeared more tolerant than P. verrucosa in both treatments. The intertidal corals decreased their respiration rates to control levels by the end of thermal stress and, both initially and throughout the study, maintained higher Symbiodiniaceae densities, chlorophyll-a, and lipid concentrations than their subtidal conspecifics. Discussion The tolerance of A. irregularis may stem from thicker tissue which allowed higher Symbiodiniaceae density and lipid concentrations and lower P:R ratios consistent with a more heterotrophic nature. The photosynthetic and growth rates, Symbiodiniaceae density, chlorophyll-a concentration, and lipid concentration of both species from both habitats did not recover two months after thermal stress indicating that restoration of physiological homeostasis following prolonged thermal stress likely requires substantially longer periods. Therefore, the results in this study should be interpreted as evidence of differential tolerance and early recovery responses rather than complete resilience. These findings provide insight into the physiological mechanisms underpinning thermal tolerance in high-latitude corals, highlighting that corals persisting in environmentally variable environments can exhibit traits critical for understanding resilience to climate change. An important caveat to consider, despite regular water changes, the closed recirculating systems may accumulate metabolic waste products over time, which can independently affect coral physiology and confound thermal stress responses.</w:t>
+        <w:t>摘要：引言 对南非等未受研究地区的栖息地与环境状况对比的珊瑚进行热应力实验对于阐明珊瑚对热应力的恢复力/敏感性的机制至关重要。本研究研究了从南非东海岸环境变化的潮间带和更稳定的潮下生境收集的不规则巨形藻（块状形态）和疣状波西洛波拉（分枝形态）的热弹性/敏感性。方法 将珊瑚饲养在封闭的循环水族箱中，并暴露在两种热应激条件（28°C 和 30°C）下三个月，然后在对照条件（26°C）下恢复两个月。每月测量呼吸、光合作用和生长速率。在热应激开始和结束以及恢复期结束时分析共生科密度、叶绿素a浓度和脂质浓度。结果这些处理引起了两个栖息地的两个物种的白化，并导致光合作用和生长速率下降。在整个实验过程中，观察到物种和栖息地之间所有测量的生理参数的固有差异，包括生存的变化，这强调了环境起源和可能的形态可以影响耐热性。潮间带珊瑚比潮下同种珊瑚更具耐受性，而 A.规则珊瑚似乎比 P. 更耐受。潮间带珊瑚在热应激结束时将其呼吸速率降低到控制水平，并且在研究开始和整个研究过程中，与潮下同种珊瑚相比，保持了更高的共生藻密度、叶绿素-a 和脂质浓度。 不规则藻可能源于较厚的组织，这使得共生藻密度和脂质浓度较高，并且 P:R 比率较低，这与更异养的性质一致。两个栖息地的两个物种的光合作用和生长速率、共生科密度、叶绿素a浓度和脂质浓度在热应激后两个月都没有恢复，这表明长期热应激后恢复生理稳态可能需要更长的时间。因此，本研究的结果应被解释为差异耐受性和早期恢复反应的证据，而不是完全复原力的证据。这些发现提供了对高纬度珊瑚耐热性的生理机制的深入了解，强调了在环境变化的环境中持续存在的珊瑚可以表现出对于了解气候变化恢复能力至关重要的特征。需要考虑的一个重要警告是，尽管定期换水，封闭的再循环系统可能会随着时间的推移积累代谢废物，这会独立影响珊瑚的生理机能并混淆热应激反应。</w:t>
       </w:r>
     </w:p>
     <w:p>
@@ -218,7 +218,7 @@
           <w:rFonts w:ascii="Microsoft YaHei" w:hAnsi="Microsoft YaHei" w:eastAsia="Microsoft YaHei"/>
           <w:sz w:val="17"/>
         </w:rPr>
-        <w:t>摘要：Abstract Anticyclonic eddies (ACEs) restructure resources and drive trophic cascades, yet depth-resolved effects on nanoflagellate bacterivory remain unclear. We quantify bacterivory by phago-mixotrophic nanophytoplankton (PMNP) and heterotrophic nanoflagellate (HNF) using fluorescent-bead incubations in a warm-core ACE in the South China Sea. Despite a 16% decline in nanoeukaryotes, PMNP abundance increases significantly (2.8× surface, 1.4× deep chlorophyll maximum (DCM), shifts toward larger cells, and elevates bacterial turnover and phago-mixotrophic production. HNF community grazing also increases at both euphotic depths despite similar per-cell rates, yielding impacts comparable to PMNP. Structural equation models link PMNP grazing to surface water-mass properties and nutrients and DCM turbidity, whereas HNF grazing tracks water-mass and prey/virus dynamics. In the mesopelagic zone, HNFs dominate; grazing HNF abundance increases 2.7× at 500 m and is associated with particulate beam attenuation coefficient, an in situ particle proxy. These findings reveal a depth-partitioned response coupling mesoscale forcing to microbial carbon processing.</w:t>
+        <w:t>摘要：反气旋涡流（ACE）重组资源并驱动营养级联，但对纳米鞭毛虫细菌的深度分辨影响仍不清楚。我们利用南海暖核 ACE 中的荧光珠孵化，通过吞噬混合营养型纳米浮游植物 (PMNP) 和异养纳米鞭毛虫 (HNF) 来量化细菌的数量。尽管纳米真核生物减少了 16%，PMNP 丰度显着增加（2. 4 倍深叶绿素最大值 (DCM)，转向较大的细胞，并提高细菌周转和吞噬混合营养生产。尽管每细胞速率相似，HNF 群落放牧也在两个真光深度增加，产生与 PMNP 相当的影响。结构方程模型将 PMNP 放牧与地表水质量、营养物质和 DCM 联系起来浑浊度，而 HNF 放牧跟踪水团和猎物/病毒动态，在中层区域，HNF 占主导地位；放牧 HNF 丰度在 500 m 处增加 2. 7 倍，并与颗粒束衰减系数（原位颗粒代表）相关。这些发现揭示了中尺度强迫与微生物碳处理的深度分区响应。</w:t>
       </w:r>
     </w:p>
     <w:p>
@@ -299,7 +299,7 @@
           <w:rFonts w:ascii="Microsoft YaHei" w:hAnsi="Microsoft YaHei" w:eastAsia="Microsoft YaHei"/>
           <w:sz w:val="17"/>
         </w:rPr>
-        <w:t>摘要：The polar marine microbial carbon pump (MCP) is a key component in global carbon sequestration and climate regulation systems. The research addresses the regulatory and adaptive principles of the polar marine MCP systems in response to climate change by conducting an integrated research on the microbial ecological, biogeochemical and environmental adaptation processes. We are focusing on the microbial communities in arctic and antarctic waters, their physiologic/evolutionary adaptation strategies and carbon transformation abilities under environmental change forcing. Our research has demonstrated that marine polar microorganisms have developed sophisticated strategies to survive in such a cold environment with responses of high expression of cryoprotectants, changes of cell membrane and metabolic pathways. The research suggests that anthropogenic global warming has dramatic effects on the efficiency of MCP due to shifts of thermal conditions, cryospheric processes and carbonate chemistry. Notably, our comparative study revealed that the polar region responses are different between polar regions as the Arctic had high metabolic flexibility, while Antarctic had high cold-adapted Arctic. These findings help us get valuable information regarding the sensitivity of polar carbon storage systems and potential feedbacks to climate.</w:t>
+        <w:t>摘要：极地海洋微生物碳泵（MCP）是全球碳封存和气候调节系统的关键组成部分。该研究通过对微生物生态、生物地球化学和环境适应过程进行综合研究，探讨了极地海洋MCP系统应对气候变化的调节和适应原理。我们关注北极和南极水域的微生物群落、它们在环境变化强迫下的生理/进化适应策略和碳转化能力。我们的研究表明，海洋极地微生物已经发展出复杂的策略来在如此寒冷的环境中生存，并通过冷冻保护剂的高表达、细胞膜和代谢途径的变化做出反应。研究表明，由于热条件、冰冻圈过程和碳酸盐化学的变化，人为全球变暖对 MCP 的效率产生巨大影响。值得注意的是，我们的比较研究表明，极地地区之间的反应是不同的，因为北极具有较高的代谢灵活性，而南极洲具有较高的冷适应能力。这些发现帮助我们获得有关极地碳储存系统的敏感性和对气候的潜在反馈的有价值的信息。</w:t>
       </w:r>
     </w:p>
     <w:p>
@@ -461,7 +461,7 @@
           <w:rFonts w:ascii="Microsoft YaHei" w:hAnsi="Microsoft YaHei" w:eastAsia="Microsoft YaHei"/>
           <w:sz w:val="17"/>
         </w:rPr>
-        <w:t>摘要：Estuarine and coastal ecosystems are facing significant threats from compounded pressures, such as land-based pollution and mariculture activities. These ecosystems confront severe challenges, including increasing environmental burdens and declining ecological health. Traditional evaluation methods that rely on statistical data struggle to meet the requirements for refined management of estuarine and coastal water environments. Taking Qinzhou Bay as a case study, this research incorporated multi-source data (including water quality indicators retrieved from remote sensing imagery, mariculture distribution, and land use information) into an integrated ecological health assessment system that combined remotely sensed data with the Pressure–State–Response (PSR) model. This approach enables a spatially continuous and quantitative evaluation of ecological health conditions for August 2015 (flood season), December 2015 (non-flood season), May 2022 (flood season), and December 2022 (non-flood season). The results indicated significant seasonal differences in the ecological health of Qinzhou Bay, with conditions generally better during the non-flood season than the flood season. Based on a comparison between the indicative estimation for 2015 and the inversion results for 2022, the overall ecological health index in 2022 showed an increasing trend, although some nearshore and estuarine areas experienced a declining trend. This study incorporated multi-source data, including remote sensing, into the PSR model framework, thereby advancing ecological health assessment from conventional discrete station-based evaluation to spatially continuous assessment. The effectiveness of this methodological approach in identifying spatiotemporal variations in the ecological health of estuarine and coastal zones was validated, providing scientific support for the refined management of estuarine and coastal water environments and ecological restoration.</w:t>
+        <w:t>摘要：河口和沿海生态系统正面临来自陆地污染和海水养殖活动等复合压力的重大威胁。这些生态系统面临着严峻的挑战，包括环境负担增加和生态健康状况下降。传统的依赖统计数据的评价方法难以满足河口沿岸水环境精细化管理的要求。本研究以钦州湾为案例，将多源数据（包括遥感影像的水质指标、海水养殖分布和土地利用信息）纳入遥感数据与压力-状态-响应（PSR）模型相结合的综合生态健康评估系统。该方法能够对2015年8月（汛期）、2015年12月（非汛期）、2022年5月（汛期）和2022年12月（非汛期）的生态健康状况进行空间连续定量评估。结果表明，钦州湾生态健康状况存在显着的季节差异，非汛期总体状况优于汛期。对比2015年指示性估算和2022年反演结果，2022年总体生态健康指数呈上升趋势，但部分近岸和河口地区出现下降趋势。本研究将遥感等多源数据纳入PSR模型框架，从而将生态健康评估从传统的基于离散站点的评估推进到空间连续评估。 验证了该方法在识别河口沿岸生态健康时空变化的有效性，为河口沿岸水环境精细化管理和生态恢复提供科学支撑。</w:t>
       </w:r>
     </w:p>
     <w:p>
@@ -550,7 +550,7 @@
           <w:rFonts w:ascii="Microsoft YaHei" w:hAnsi="Microsoft YaHei" w:eastAsia="Microsoft YaHei"/>
           <w:sz w:val="17"/>
         </w:rPr>
-        <w:t>摘要：This study developed an anomaly-based framework to map potential fishing zones (PFZs) in the Makassar Strait from satellite-derived sea surface temperature (SST) and chlorophyll-a (Chl-a) during 2022–2024. Daily GCOM-C/SGLI Level-3 Version 3 products were quality-masked, converted to physical units, aggregated to a 0.1° × 0.1° grid, and summarized as monthly composites. Monthly anomalies were then calculated relative to a month-specific three-year climatology. PFZs were defined as pixels simultaneously showing high Chl-a anomalies, represented by the 80th percentile of the spatial distribution of the temporal mean anomaly field, and relative cooling (SST anomaly ≤ 0). Monthly PFZ area ranged from 4,658 to 144,923 km², with a mean of 52,606 ± 33,834 km², whereas PFZ area fraction ranged from 0.012 to 0.352, with a mean of 0.130 ± 0.084. Seasonally, PFZs were most extensive during JJA (mean 66,973 km²; fraction 0.161) and least extensive during DJF (43,046 km²; fraction 0.112). Recurrent PFZ hotspots were concentrated in the central-southern Makassar Strait and along the eastern sector near the Sulawesi coast, where occurrence frequency reached about 58%. Valid-pixel diagnostics showed relatively stable AOI-level coverage (SST mean 0.534; Chl-a mean 0.548), indicating that the observed PFZ variability could not be explained by data gaps alone. These findings indicate that recurrent PFZs can be interpreted as pelagic ecosystem service hotspots that support ecosystem-based fisheries management, biodiversity conservation, and the sustainable use of marine resources, while aligning with SDG 14 (Life Below Water) and the post-2020 global biodiversity framework of the Convention on Biological Diversity.</w:t>
+        <w:t>摘要：这项研究开发了一个基于异常的框架，根据 2022 年至 2024 年期间卫星获得的海面温度 (SST) 和叶绿素-a (Chl-a) 绘制望加锡海峡的潜在捕鱼区 (PFZ)。每日 GCOM-C/SGLI Level-3 第 3 版产品经过质量屏蔽、转换为物理单位、聚合为 0. 1° 网格，并汇总为每月综合数据。然后相对于特定月份的三年气候学计算每月异常情况。 PFZ 被定义为同时显示高叶绿素 a 异常的像素，由时间平均异常场空间分布的第 80 个百分位数表示，并且相对冷却（海温异常 ≤ 0）。每月 PFZ 面积范围为 4,658 至 144,923 km²，平均值为 52,606 ± 33,834 km²，而 PFZ 面积分数范围为 0。从季节上看，PFZ 在 JJA 期间最广泛（平均 66,973 km²；分数 0. 161），在 DJF 期间最广泛（43,046 km²；分数 0. 161）。反复出现的 PFZ 热点集中在望加锡海峡中南部和苏拉威西海岸附近的东部地区，有效像素诊断显示 AOI 水平覆盖相对稳定（SST 平均值为 0. 548），这表明观察到的 PFZ 变化不能仅用数据差距来解释。支持基于生态系统的渔业管理、生物多样性保护和海洋资源的可持续利用，同时符合可持续发展目标 14（水下生物）和《生物多样性公约》2020 年后全球生物多样性框架。</w:t>
       </w:r>
     </w:p>
     <w:p>

</xml_diff>